<commit_message>
Add new enemy pets, weapons, and assets
Adds multiple new enemy scenes, weapon components, and related assets. New scenes: pet_beaver, pet_cow, pet_crab, pet_dog, pet_monkey, pet_panda (plus several .tmp helpers). Adds enemy-type scripts and component scripts (WeaponShotgun, WeaponTrap, TrapMine, and various Pet<Animal>.gd files) and their UID metadata. Adds new model and texture assets from PlatformerKit (bomb, button-round, button-square, colormap) including their .import files. Updates existing content: pet_bunny and pet_fox scenes (weapon swaps and stat/tuning changes), modified scripts Enemy.gd and MortarShell.gd, and arena_base.tscn to register the new enemy scenes; also updates gdd-rebound-protocol.docx binary. Overall this expands the enemy roster and introduces new weapon behaviors and balancing tweaks.
</commit_message>
<xml_diff>
--- a/gdd-rebound-protocol.docx
+++ b/gdd-rebound-protocol.docx
@@ -867,7 +867,7 @@
           <w:sz w:val="28"/>
           <w:szCs w:val="28"/>
         </w:rPr>
-        <w:t xml:space="preserve">Crabe — Lateral</w:t>
+        <w:t xml:space="preserve">Crabe — Tank blinde</w:t>
       </w:r>
     </w:p>
     <w:p>
@@ -896,7 +896,7 @@
           <w:sz w:val="22"/>
           <w:szCs w:val="22"/>
         </w:rPr>
-        <w:t xml:space="preserve">blaster-g</w:t>
+        <w:t xml:space="preserve">blaster-f</w:t>
       </w:r>
     </w:p>
     <w:p>
@@ -925,7 +925,7 @@
           <w:sz w:val="22"/>
           <w:szCs w:val="22"/>
         </w:rPr>
-        <w:t xml:space="preserve">Tire en diagonale (jamais droit devant) tout en se deplacant uniquement sur les cotes. Balles a 45 degres.</w:t>
+        <w:t xml:space="preserve">Avance lentement vers le joueur (80 HP). Tire des balles lourdes a courte portee. Active un bouclier spherique bleu toutes les 8 secondes pendant 3 secondes — immunite totale aux degats.</w:t>
       </w:r>
     </w:p>
     <w:p>
@@ -954,7 +954,7 @@
           <w:sz w:val="22"/>
           <w:szCs w:val="22"/>
         </w:rPr>
-        <w:t xml:space="preserve">Les balles arrivent d'un angle inhabituel que le joueur ne surveille pas naturellement.</w:t>
+        <w:t xml:space="preserve">Ennemi-tank qui oblige le joueur a adapter son rythme d'attaque. Le bouclier periodique cree une fenetres de vulnerabilite clairement lisible.</w:t>
       </w:r>
     </w:p>
     <w:p>
@@ -983,7 +983,7 @@
           <w:sz w:val="22"/>
           <w:szCs w:val="22"/>
         </w:rPr>
-        <w:t xml:space="preserve">Deplacement predictible (toujours lateral). Facile d'anticiper sa position.</w:t>
+        <w:t xml:space="preserve">Tres lent. Hors portee de tir, il est inoffensif. Les 5 secondes sans bouclier sont la fenetre d'elimination.</w:t>
       </w:r>
     </w:p>
     <w:p>
@@ -1290,7 +1290,7 @@
           <w:sz w:val="28"/>
           <w:szCs w:val="28"/>
         </w:rPr>
-        <w:t xml:space="preserve">Panda — Bouclier rotatif</w:t>
+        <w:t xml:space="preserve">Panda — Corps-a-corps</w:t>
       </w:r>
     </w:p>
     <w:p>
@@ -1319,7 +1319,7 @@
           <w:sz w:val="22"/>
           <w:szCs w:val="22"/>
         </w:rPr>
-        <w:t xml:space="preserve">blaster-n</w:t>
+        <w:t xml:space="preserve">Aucune (corps-a-corps)</w:t>
       </w:r>
     </w:p>
     <w:p>
@@ -1348,7 +1348,7 @@
           <w:sz w:val="22"/>
           <w:szCs w:val="22"/>
         </w:rPr>
-        <w:t xml:space="preserve">Tire des boulets lents a grosse hitbox. Presente un mini-bouclier frontal pendant 3 secondes qui absorbe une balle renvoyee.</w:t>
+        <w:t xml:space="preserve">Fonce vers le joueur sans jamais s'arreter. Inflige des degats de melee au contact (18 degats toutes les 1,2 secondes via une zone de detection). Pas de tir a distance.</w:t>
       </w:r>
     </w:p>
     <w:p>
@@ -1377,7 +1377,7 @@
           <w:sz w:val="22"/>
           <w:szCs w:val="22"/>
         </w:rPr>
-        <w:t xml:space="preserve">Force le joueur a viser le dos ou les cotes plutot que de parer frontalement.</w:t>
+        <w:t xml:space="preserve">Oblige le joueur a le prioriser ou a fuir. Le parry n'a aucun effet — c'est une source de pression pure qui diversifie le gameplay.</w:t>
       </w:r>
     </w:p>
     <w:p>
@@ -1406,7 +1406,7 @@
           <w:sz w:val="22"/>
           <w:szCs w:val="22"/>
         </w:rPr>
-        <w:t xml:space="preserve">Le bouclier ne couvre pas les flancs. Contourner = victoire facile.</w:t>
+        <w:t xml:space="preserve">Previsible dans sa trajectoire (ligne droite). Les balles renvoyees d'autres ennemis peuvent l'eliminer facilement.</w:t>
       </w:r>
     </w:p>
     <w:p>

</xml_diff>

<commit_message>
Add Koala & Penguin enemies and sniper weapon
Introduce two new enemy types (PetKoala, PetPenguin) with scenes, scripts and UID files, and add a new WeaponSniper component used by the koala. PetPenguin implements sliding/stop behavior and world-space weapon mounting; PetKoala uses a charging sniper with visual laser/reticle and a single powerful shot. Update pet_cow.tscn (resource UIDs, weapon model/params, node unique_ids and transforms), remove pet_shooter.tscn, and register the new enemy scenes in arena_base.tscn (also adjust a few transforms/positions). A project document (gdd-rebound-protocol.docx) was also updated.
</commit_message>
<xml_diff>
--- a/gdd-rebound-protocol.docx
+++ b/gdd-rebound-protocol.docx
@@ -614,7 +614,7 @@
           <w:sz w:val="22"/>
           <w:szCs w:val="22"/>
         </w:rPr>
-        <w:t xml:space="preserve">blaster-e</w:t>
+        <w:t xml:space="preserve">blaster-l</w:t>
       </w:r>
     </w:p>
     <w:p>
@@ -755,7 +755,7 @@
           <w:sz w:val="22"/>
           <w:szCs w:val="22"/>
         </w:rPr>
-        <w:t xml:space="preserve">blaster-f</w:t>
+        <w:t xml:space="preserve">blaster-i</w:t>
       </w:r>
     </w:p>
     <w:p>
@@ -896,7 +896,7 @@
           <w:sz w:val="22"/>
           <w:szCs w:val="22"/>
         </w:rPr>
-        <w:t xml:space="preserve">blaster-f</w:t>
+        <w:t xml:space="preserve">blaster-j</w:t>
       </w:r>
     </w:p>
     <w:p>
@@ -1601,7 +1601,7 @@
           <w:sz w:val="22"/>
           <w:szCs w:val="22"/>
         </w:rPr>
-        <w:t xml:space="preserve">grenade-a</w:t>
+        <w:t xml:space="preserve">Aucune (pas d'arme visible sur l'animal — les mines sont posees au sol)</w:t>
       </w:r>
     </w:p>
     <w:p>
@@ -1630,7 +1630,7 @@
           <w:sz w:val="22"/>
           <w:szCs w:val="22"/>
         </w:rPr>
-        <w:t xml:space="preserve">Recule en permanence et lache des mines au sol (disques visibles). Les mines explosent au contact du joueur apres 0,5 seconde de delai.</w:t>
+        <w:t xml:space="preserve">Recule en permanence et pose des mines au sol (button-round, disque plat reconnaissable). Les mines clignottent en rouge dans les 5 dernieres secondes de leur vie puis disparaissent. Elles explosent au contact du joueur.</w:t>
       </w:r>
     </w:p>
     <w:p>

</xml_diff>